<commit_message>
crouching and sprinting working
</commit_message>
<xml_diff>
--- a/project writeup.docx
+++ b/project writeup.docx
@@ -11,67 +11,75 @@
       <w:r>
         <w:tab/>
       </w:r>
-      <w:proofErr w:type="gramStart"/>
-      <w:r>
-        <w:t>So</w:t>
-      </w:r>
-      <w:proofErr w:type="gramEnd"/>
-      <w:r>
-        <w:t xml:space="preserve"> I was trying to figure out a unique premise for a game prototype for this </w:t>
-      </w:r>
-      <w:proofErr w:type="gramStart"/>
-      <w:r>
-        <w:t>assignment</w:t>
-      </w:r>
-      <w:proofErr w:type="gramEnd"/>
-      <w:r>
-        <w:t xml:space="preserve"> and I realized that there aren’t really many video games that are tag. Everything that comes to my mind is usually going to dodgeball, and I think the closest tag like game that I know of is the infection </w:t>
-      </w:r>
-      <w:proofErr w:type="spellStart"/>
-      <w:r>
-        <w:t>gamemode</w:t>
-      </w:r>
-      <w:proofErr w:type="spellEnd"/>
-      <w:r>
-        <w:t xml:space="preserve"> in forza horizon. </w:t>
-      </w:r>
-      <w:proofErr w:type="gramStart"/>
-      <w:r>
-        <w:t>So</w:t>
-      </w:r>
-      <w:proofErr w:type="gramEnd"/>
-      <w:r>
-        <w:t xml:space="preserve"> this is the path </w:t>
-      </w:r>
-      <w:proofErr w:type="spellStart"/>
-      <w:r>
-        <w:t>im</w:t>
-      </w:r>
-      <w:proofErr w:type="spellEnd"/>
-      <w:r>
-        <w:t xml:space="preserve"> going for my prototype.</w:t>
+      <w:r>
+        <w:t>So I was trying to figure out a unique premise for a game prototype for this assignment and I realized that there aren’t really many video games that are tag. Everything that comes to my mind is usually going to dodgeball, and I think the closest tag like game that I know of is the infection gamemode in forza horizon. So this is the path im going for my prototype.</w:t>
       </w:r>
     </w:p>
     <w:p/>
+    <w:p>
+      <w:r>
+        <w:t xml:space="preserve">So in addition to the basic movement options within the unreal first person I needed to add these elements to players </w:t>
+      </w:r>
+    </w:p>
+    <w:p>
+      <w:r>
+        <w:t xml:space="preserve">Stamina </w:t>
+      </w:r>
+    </w:p>
+    <w:p>
+      <w:r>
+        <w:tab/>
+        <w:t>So that players aren’t just able to run all the time I want there to be a bit otf stratefy on when to run when to dodge etc</w:t>
+      </w:r>
+    </w:p>
+    <w:p>
+      <w:r>
+        <w:t>Diving</w:t>
+      </w:r>
+    </w:p>
+    <w:p>
+      <w:r>
+        <w:tab/>
+        <w:t>This is mainly for taggers to give them a last gasp effort on getting a player</w:t>
+      </w:r>
+    </w:p>
+    <w:p>
+      <w:r>
+        <w:t>Sliding</w:t>
+      </w:r>
+    </w:p>
+    <w:p>
+      <w:r>
+        <w:tab/>
+        <w:t xml:space="preserve">This is a movement tool that both taggers and tagees can use to boost movement speed and also to </w:t>
+      </w:r>
+    </w:p>
+    <w:p>
+      <w:r>
+        <w:tab/>
+      </w:r>
+    </w:p>
     <w:p/>
     <w:p>
       <w:r>
-        <w:t xml:space="preserve">Stamina </w:t>
-      </w:r>
-    </w:p>
-    <w:p>
-      <w:r>
         <w:t>Timed rounds</w:t>
       </w:r>
     </w:p>
     <w:p>
       <w:r>
-        <w:t>Diving</w:t>
-      </w:r>
-    </w:p>
-    <w:p>
-      <w:r>
-        <w:t>Sliding</w:t>
+        <w:tab/>
+        <w:t>Rounds are 3-5 minutes long to keep from the state of everything getting stuck</w:t>
+      </w:r>
+    </w:p>
+    <w:p>
+      <w:r>
+        <w:t xml:space="preserve">Physics </w:t>
+      </w:r>
+    </w:p>
+    <w:p>
+      <w:r>
+        <w:tab/>
+        <w:t>To add challenge the environment can vary from round to round because the smaller props are not static and impacted by physics</w:t>
       </w:r>
     </w:p>
     <w:p>

</xml_diff>

<commit_message>
REVERT TO HERE IF THINGS BREAK
</commit_message>
<xml_diff>
--- a/project writeup.docx
+++ b/project writeup.docx
@@ -11,59 +11,14 @@
       <w:r>
         <w:tab/>
       </w:r>
-      <w:proofErr w:type="gramStart"/>
-      <w:r>
-        <w:t>So</w:t>
-      </w:r>
-      <w:proofErr w:type="gramEnd"/>
-      <w:r>
-        <w:t xml:space="preserve"> I was trying to figure out a unique premise for a game prototype for this </w:t>
-      </w:r>
-      <w:proofErr w:type="gramStart"/>
-      <w:r>
-        <w:t>assignment</w:t>
-      </w:r>
-      <w:proofErr w:type="gramEnd"/>
-      <w:r>
-        <w:t xml:space="preserve"> and I realized that there aren’t really many video games that are tag. Everything that comes to my mind is usually going to dodgeball, and I think the closest tag like game that I know of is the infection </w:t>
-      </w:r>
-      <w:proofErr w:type="spellStart"/>
-      <w:r>
-        <w:t>gamemode</w:t>
-      </w:r>
-      <w:proofErr w:type="spellEnd"/>
-      <w:r>
-        <w:t xml:space="preserve"> in forza horizon. </w:t>
-      </w:r>
-      <w:proofErr w:type="gramStart"/>
-      <w:r>
-        <w:t>So</w:t>
-      </w:r>
-      <w:proofErr w:type="gramEnd"/>
-      <w:r>
-        <w:t xml:space="preserve"> this is the path </w:t>
-      </w:r>
-      <w:proofErr w:type="spellStart"/>
-      <w:r>
-        <w:t>im</w:t>
-      </w:r>
-      <w:proofErr w:type="spellEnd"/>
-      <w:r>
-        <w:t xml:space="preserve"> going for my prototype.</w:t>
+      <w:r>
+        <w:t>So I was trying to figure out a unique premise for a game prototype for this assignment and I realized that there aren’t really many video games that are tag. Everything that comes to my mind is usually going to dodgeball, and I think the closest tag like game that I know of is the infection gamemode in forza horizon. So this is the path im going for my prototype.</w:t>
       </w:r>
     </w:p>
     <w:p/>
     <w:p>
       <w:r>
-        <w:t xml:space="preserve">So in addition to the basic movement options within the unreal first </w:t>
-      </w:r>
-      <w:proofErr w:type="gramStart"/>
-      <w:r>
-        <w:t>person</w:t>
-      </w:r>
-      <w:proofErr w:type="gramEnd"/>
-      <w:r>
-        <w:t xml:space="preserve"> I needed to add these elements to players </w:t>
+        <w:t xml:space="preserve">So in addition to the basic movement options within the unreal first person I needed to add these elements to players </w:t>
       </w:r>
     </w:p>
     <w:p>
@@ -74,29 +29,8 @@
     <w:p>
       <w:r>
         <w:tab/>
-        <w:t xml:space="preserve">So that players aren’t just able to run all the time I want there to be a bit </w:t>
-      </w:r>
-      <w:proofErr w:type="spellStart"/>
-      <w:r>
-        <w:t>otf</w:t>
-      </w:r>
-      <w:proofErr w:type="spellEnd"/>
-      <w:r>
-        <w:t xml:space="preserve"> </w:t>
-      </w:r>
-      <w:proofErr w:type="spellStart"/>
-      <w:r>
-        <w:t>stratefy</w:t>
-      </w:r>
-      <w:proofErr w:type="spellEnd"/>
-      <w:r>
-        <w:t xml:space="preserve"> on when to run when to dodge </w:t>
-      </w:r>
-      <w:proofErr w:type="spellStart"/>
-      <w:r>
-        <w:t>etc</w:t>
-      </w:r>
-      <w:proofErr w:type="spellEnd"/>
+        <w:t>So that players aren’t just able to run all the time I want there to be a bit otf stratefy on when to run when to dodge etc</w:t>
+      </w:r>
     </w:p>
     <w:p>
       <w:r>
@@ -117,23 +51,7 @@
     <w:p>
       <w:r>
         <w:tab/>
-        <w:t xml:space="preserve">This is a movement tool that both taggers and </w:t>
-      </w:r>
-      <w:proofErr w:type="spellStart"/>
-      <w:r>
-        <w:t>tagees</w:t>
-      </w:r>
-      <w:proofErr w:type="spellEnd"/>
-      <w:r>
-        <w:t xml:space="preserve"> can use to boost movement speed </w:t>
-      </w:r>
-      <w:proofErr w:type="gramStart"/>
-      <w:r>
-        <w:t>and also</w:t>
-      </w:r>
-      <w:proofErr w:type="gramEnd"/>
-      <w:r>
-        <w:t xml:space="preserve"> to </w:t>
+        <w:t xml:space="preserve">This is a movement tool that both taggers and tagees can use to boost movement speed and also to </w:t>
       </w:r>
     </w:p>
     <w:p>
@@ -161,15 +79,7 @@
     <w:p>
       <w:r>
         <w:tab/>
-        <w:t xml:space="preserve">To add </w:t>
-      </w:r>
-      <w:proofErr w:type="gramStart"/>
-      <w:r>
-        <w:t>challenge</w:t>
-      </w:r>
-      <w:proofErr w:type="gramEnd"/>
-      <w:r>
-        <w:t xml:space="preserve"> the environment can vary from round to round because the smaller props are not static and impacted by physics</w:t>
+        <w:t>To add challenge the environment can vary from round to round because the smaller props are not static and impacted by physics</w:t>
       </w:r>
     </w:p>
     <w:p>
@@ -202,13 +112,8 @@
       </w:r>
     </w:p>
     <w:p>
-      <w:proofErr w:type="spellStart"/>
-      <w:r>
-        <w:t>Anti gravity</w:t>
-      </w:r>
-      <w:proofErr w:type="spellEnd"/>
-      <w:r>
-        <w:t>; lowers the gravity</w:t>
+      <w:r>
+        <w:t>Anti gravity; lowers the gravity</w:t>
       </w:r>
     </w:p>
     <w:p>
@@ -228,10 +133,227 @@
       </w:r>
     </w:p>
     <w:p>
-      <w:r>
+      <w:pPr>
+        <w:rPr>
+          <w:strike/>
+        </w:rPr>
+      </w:pPr>
+      <w:r>
+        <w:rPr>
+          <w:strike/>
+        </w:rPr>
+        <w:t>Basic movement</w:t>
+      </w:r>
+      <w:r>
+        <w:rPr>
+          <w:strike/>
+        </w:rPr>
         <w:t xml:space="preserve"> </w:t>
       </w:r>
     </w:p>
+    <w:p>
+      <w:r>
+        <w:t>Camera controls</w:t>
+      </w:r>
+    </w:p>
+    <w:p>
+      <w:r>
+        <w:t>Sprinting</w:t>
+      </w:r>
+    </w:p>
+    <w:p>
+      <w:r>
+        <w:tab/>
+      </w:r>
+      <w:r>
+        <w:t>Timed sprinting</w:t>
+      </w:r>
+    </w:p>
+    <w:p>
+      <w:r>
+        <w:t>Crouching</w:t>
+      </w:r>
+    </w:p>
+    <w:p>
+      <w:pPr>
+        <w:rPr>
+          <w:strike/>
+        </w:rPr>
+      </w:pPr>
+      <w:r>
+        <w:tab/>
+      </w:r>
+      <w:r>
+        <w:rPr>
+          <w:strike/>
+        </w:rPr>
+        <w:t>Slow speed down</w:t>
+      </w:r>
+    </w:p>
+    <w:p>
+      <w:r>
+        <w:tab/>
+        <w:t>Lower hit boxes to go under stuff</w:t>
+      </w:r>
+    </w:p>
+    <w:p>
+      <w:r>
+        <w:t>Tagging</w:t>
+      </w:r>
+    </w:p>
+    <w:p>
+      <w:pPr>
+        <w:rPr>
+          <w:strike/>
+        </w:rPr>
+      </w:pPr>
+      <w:r>
+        <w:tab/>
+      </w:r>
+      <w:r>
+        <w:rPr>
+          <w:strike/>
+        </w:rPr>
+        <w:t>Hitbox for taggin</w:t>
+      </w:r>
+    </w:p>
+    <w:p>
+      <w:pPr>
+        <w:rPr>
+          <w:strike/>
+        </w:rPr>
+      </w:pPr>
+      <w:r>
+        <w:tab/>
+      </w:r>
+      <w:r>
+        <w:rPr>
+          <w:strike/>
+        </w:rPr>
+        <w:t>Checking if things are in hitbox</w:t>
+      </w:r>
+    </w:p>
+    <w:p>
+      <w:pPr>
+        <w:rPr>
+          <w:strike/>
+        </w:rPr>
+      </w:pPr>
+      <w:r>
+        <w:tab/>
+      </w:r>
+      <w:r>
+        <w:rPr>
+          <w:strike/>
+        </w:rPr>
+        <w:t>Button to start a check</w:t>
+      </w:r>
+    </w:p>
+    <w:p>
+      <w:pPr>
+        <w:rPr>
+          <w:strike/>
+        </w:rPr>
+      </w:pPr>
+      <w:r>
+        <w:tab/>
+      </w:r>
+      <w:r>
+        <w:rPr>
+          <w:strike/>
+        </w:rPr>
+        <w:t>What to do if a player character is in box during check</w:t>
+      </w:r>
+    </w:p>
+    <w:p>
+      <w:pPr>
+        <w:rPr>
+          <w:strike/>
+        </w:rPr>
+      </w:pPr>
+      <w:r>
+        <w:tab/>
+      </w:r>
+      <w:r>
+        <w:rPr>
+          <w:strike/>
+        </w:rPr>
+        <w:t>Spam prevention</w:t>
+      </w:r>
+    </w:p>
+    <w:p>
+      <w:r>
+        <w:t>Who is it</w:t>
+      </w:r>
+    </w:p>
+    <w:p>
+      <w:r>
+        <w:tab/>
+        <w:t>Starting player who is it</w:t>
+      </w:r>
+    </w:p>
+    <w:p>
+      <w:r>
+        <w:tab/>
+        <w:t>Transferring who is it</w:t>
+      </w:r>
+    </w:p>
+    <w:p>
+      <w:r>
+        <w:t>Sliding</w:t>
+      </w:r>
+    </w:p>
+    <w:p>
+      <w:r>
+        <w:t>Diving</w:t>
+      </w:r>
+    </w:p>
+    <w:p>
+      <w:r>
+        <w:t>Rounds</w:t>
+      </w:r>
+    </w:p>
+    <w:p>
+      <w:pPr>
+        <w:rPr>
+          <w:strike/>
+        </w:rPr>
+      </w:pPr>
+      <w:r>
+        <w:tab/>
+      </w:r>
+      <w:r>
+        <w:rPr>
+          <w:strike/>
+        </w:rPr>
+        <w:t>Timer for how long round is</w:t>
+      </w:r>
+    </w:p>
+    <w:p>
+      <w:pPr>
+        <w:rPr>
+          <w:strike/>
+        </w:rPr>
+      </w:pPr>
+      <w:r>
+        <w:tab/>
+      </w:r>
+      <w:r>
+        <w:rPr>
+          <w:strike/>
+        </w:rPr>
+        <w:t xml:space="preserve">Finding who is it at end </w:t>
+      </w:r>
+    </w:p>
+    <w:p>
+      <w:pPr>
+        <w:ind w:firstLine="720"/>
+      </w:pPr>
+      <w:r>
+        <w:t>Resetting for new round</w:t>
+      </w:r>
+    </w:p>
+    <w:p/>
     <w:sectPr>
       <w:pgSz w:w="12240" w:h="15840"/>
       <w:pgMar w:top="1440" w:right="1440" w:bottom="1440" w:left="1440" w:header="720" w:footer="720" w:gutter="0"/>

</xml_diff>